<commit_message>
Update author metadata for MDPI submission
</commit_message>
<xml_diff>
--- a/manuscript/manuscript.docx
+++ b/manuscript/manuscript.docx
@@ -32,7 +32,7 @@
         <w:jc w:val="center"/>
       </w:pPr>
       <w:r>
-        <w:t>Affiliation: Independent Researcher</w:t>
+        <w:t>Role: Wiss. Mitarbeiter | Research Associate</w:t>
       </w:r>
     </w:p>
     <w:p>
@@ -40,7 +40,31 @@
         <w:jc w:val="center"/>
       </w:pPr>
       <w:r>
-        <w:t>Correspondence: To be supplied in the MDPI submission system.</w:t>
+        <w:t>Affiliation: Technische Universität Braunschweig, Institut für Flugführung | Institute of Flight Guidance</w:t>
+      </w:r>
+    </w:p>
+    <w:p>
+      <w:pPr>
+        <w:jc w:val="center"/>
+      </w:pPr>
+      <w:r>
+        <w:t>Address: Hermann-Blenk-Str. 27, 38108 Braunschweig, Germany</w:t>
+      </w:r>
+    </w:p>
+    <w:p>
+      <w:pPr>
+        <w:jc w:val="center"/>
+      </w:pPr>
+      <w:r>
+        <w:t>ORCID: https://orcid.org/0009-0005-1547-8992</w:t>
+      </w:r>
+    </w:p>
+    <w:p>
+      <w:pPr>
+        <w:jc w:val="center"/>
+      </w:pPr>
+      <w:r>
+        <w:t>Correspondence: parth-yogeshbhai.purohit@tu-braunschweig.de; https://www.tu-braunschweig.de/iff</w:t>
       </w:r>
     </w:p>
     <w:p>
@@ -10175,7 +10199,7 @@
     </w:p>
     <w:p>
       <w:r>
-        <w:t>This research received no external funding.</w:t>
+        <w:t>This research received no external funding. The study was conducted as independent research by the author.</w:t>
       </w:r>
     </w:p>
     <w:p>

</xml_diff>